<commit_message>
Remove temporary file and update ESP-NOW target MAC address for spare master
</commit_message>
<xml_diff>
--- a/KRAI2026Manual/Button_Mapping_KRAI2026.docx
+++ b/KRAI2026Manual/Button_Mapping_KRAI2026.docx
@@ -263,7 +263,7 @@
         <w:pStyle w:val="Heading1"/>
       </w:pPr>
       <w:r>
-        <w:t>2. Tombol</w:t>
+        <w:t>2. Tombol — Mode Manual (mode = 0)</w:t>
       </w:r>
     </w:p>
     <w:tbl>
@@ -530,7 +530,7 @@
               <w:rPr>
                 <w:sz w:val="18"/>
               </w:rPr>
-              <w:t>Slow — interval kirim 100ms, yaw step 150ms, gripper step 5</w:t>
+              <w:t>Slow — yaw step 150ms, gripper step 5</w:t>
             </w:r>
           </w:p>
         </w:tc>
@@ -571,7 +571,171 @@
               <w:rPr>
                 <w:sz w:val="18"/>
               </w:rPr>
-              <w:t>Fast — interval kirim 5ms, yaw step 25ms, gripper step 40</w:t>
+              <w:t>Fast — yaw step 25ms, gripper step 40</w:t>
+            </w:r>
+          </w:p>
+        </w:tc>
+      </w:tr>
+      <w:tr>
+        <w:tc>
+          <w:tcPr>
+            <w:tcW w:type="dxa" w:w="2880"/>
+          </w:tcPr>
+          <w:p>
+            <w:r>
+              <w:rPr>
+                <w:sz w:val="18"/>
+              </w:rPr>
+              <w:t>L2 + Triangle</w:t>
+            </w:r>
+          </w:p>
+        </w:tc>
+        <w:tc>
+          <w:tcPr>
+            <w:tcW w:type="dxa" w:w="2880"/>
+          </w:tcPr>
+          <w:p>
+            <w:r>
+              <w:rPr>
+                <w:sz w:val="18"/>
+              </w:rPr>
+              <w:t>Edge</w:t>
+            </w:r>
+          </w:p>
+        </w:tc>
+        <w:tc>
+          <w:tcPr>
+            <w:tcW w:type="dxa" w:w="2880"/>
+          </w:tcPr>
+          <w:p>
+            <w:r>
+              <w:rPr>
+                <w:sz w:val="18"/>
+              </w:rPr>
+              <w:t>User-defined action (gripper_control)</w:t>
+            </w:r>
+          </w:p>
+        </w:tc>
+      </w:tr>
+      <w:tr>
+        <w:tc>
+          <w:tcPr>
+            <w:tcW w:type="dxa" w:w="2880"/>
+          </w:tcPr>
+          <w:p>
+            <w:r>
+              <w:rPr>
+                <w:sz w:val="18"/>
+              </w:rPr>
+              <w:t>L2 + Circle + analog kiri ke kanan</w:t>
+            </w:r>
+          </w:p>
+        </w:tc>
+        <w:tc>
+          <w:tcPr>
+            <w:tcW w:type="dxa" w:w="2880"/>
+          </w:tcPr>
+          <w:p>
+            <w:r>
+              <w:rPr>
+                <w:sz w:val="18"/>
+              </w:rPr>
+              <w:t>Hold</w:t>
+            </w:r>
+          </w:p>
+        </w:tc>
+        <w:tc>
+          <w:tcPr>
+            <w:tcW w:type="dxa" w:w="2880"/>
+          </w:tcPr>
+          <w:p>
+            <w:r>
+              <w:rPr>
+                <w:sz w:val="18"/>
+              </w:rPr>
+              <w:t>Arm box R: pne ON → ARMBOX_WAIT</w:t>
+            </w:r>
+          </w:p>
+        </w:tc>
+      </w:tr>
+      <w:tr>
+        <w:tc>
+          <w:tcPr>
+            <w:tcW w:type="dxa" w:w="2880"/>
+          </w:tcPr>
+          <w:p>
+            <w:r>
+              <w:rPr>
+                <w:sz w:val="18"/>
+              </w:rPr>
+              <w:t>L2 + Circle + analog kiri ke kiri</w:t>
+            </w:r>
+          </w:p>
+        </w:tc>
+        <w:tc>
+          <w:tcPr>
+            <w:tcW w:type="dxa" w:w="2880"/>
+          </w:tcPr>
+          <w:p>
+            <w:r>
+              <w:rPr>
+                <w:sz w:val="18"/>
+              </w:rPr>
+              <w:t>Hold</w:t>
+            </w:r>
+          </w:p>
+        </w:tc>
+        <w:tc>
+          <w:tcPr>
+            <w:tcW w:type="dxa" w:w="2880"/>
+          </w:tcPr>
+          <w:p>
+            <w:r>
+              <w:rPr>
+                <w:sz w:val="18"/>
+              </w:rPr>
+              <w:t>Arm box L: pne ON → ARMBOX_WAIT</w:t>
+            </w:r>
+          </w:p>
+        </w:tc>
+      </w:tr>
+      <w:tr>
+        <w:tc>
+          <w:tcPr>
+            <w:tcW w:type="dxa" w:w="2880"/>
+          </w:tcPr>
+          <w:p>
+            <w:r>
+              <w:rPr>
+                <w:sz w:val="18"/>
+              </w:rPr>
+              <w:t>L2 + Square</w:t>
+            </w:r>
+          </w:p>
+        </w:tc>
+        <w:tc>
+          <w:tcPr>
+            <w:tcW w:type="dxa" w:w="2880"/>
+          </w:tcPr>
+          <w:p>
+            <w:r>
+              <w:rPr>
+                <w:sz w:val="18"/>
+              </w:rPr>
+              <w:t>Edge</w:t>
+            </w:r>
+          </w:p>
+        </w:tc>
+        <w:tc>
+          <w:tcPr>
+            <w:tcW w:type="dxa" w:w="2880"/>
+          </w:tcPr>
+          <w:p>
+            <w:r>
+              <w:rPr>
+                <w:sz w:val="18"/>
+              </w:rPr>
+              <w:t>User-defined action (armbox_control)</w:t>
             </w:r>
           </w:p>
         </w:tc>
@@ -709,129 +873,6 @@
               <w:rPr>
                 <w:sz w:val="18"/>
               </w:rPr>
-              <w:t>SHARE</w:t>
-            </w:r>
-          </w:p>
-        </w:tc>
-        <w:tc>
-          <w:tcPr>
-            <w:tcW w:type="dxa" w:w="2880"/>
-          </w:tcPr>
-          <w:p>
-            <w:r>
-              <w:rPr>
-                <w:sz w:val="18"/>
-              </w:rPr>
-              <w:t>Edge</w:t>
-            </w:r>
-          </w:p>
-        </w:tc>
-        <w:tc>
-          <w:tcPr>
-            <w:tcW w:type="dxa" w:w="2880"/>
-          </w:tcPr>
-          <w:p>
-            <w:r>
-              <w:rPr>
-                <w:sz w:val="18"/>
-              </w:rPr>
-              <w:t>Toggle input mode (DPAD ↔ ANALOG)</w:t>
-            </w:r>
-          </w:p>
-        </w:tc>
-      </w:tr>
-      <w:tr>
-        <w:tc>
-          <w:tcPr>
-            <w:tcW w:type="dxa" w:w="2880"/>
-          </w:tcPr>
-          <w:p>
-            <w:r>
-              <w:rPr>
-                <w:sz w:val="18"/>
-              </w:rPr>
-              <w:t>SHARE + TOUCHPAD</w:t>
-            </w:r>
-          </w:p>
-        </w:tc>
-        <w:tc>
-          <w:tcPr>
-            <w:tcW w:type="dxa" w:w="2880"/>
-          </w:tcPr>
-          <w:p>
-            <w:r>
-              <w:rPr>
-                <w:sz w:val="18"/>
-              </w:rPr>
-              <w:t>Hold 5 detik</w:t>
-            </w:r>
-          </w:p>
-        </w:tc>
-        <w:tc>
-          <w:tcPr>
-            <w:tcW w:type="dxa" w:w="2880"/>
-          </w:tcPr>
-          <w:p>
-            <w:r>
-              <w:rPr>
-                <w:sz w:val="18"/>
-              </w:rPr>
-              <w:t>Masuk mode record odom</w:t>
-            </w:r>
-          </w:p>
-        </w:tc>
-      </w:tr>
-      <w:tr>
-        <w:tc>
-          <w:tcPr>
-            <w:tcW w:type="dxa" w:w="2880"/>
-          </w:tcPr>
-          <w:p>
-            <w:r>
-              <w:rPr>
-                <w:sz w:val="18"/>
-              </w:rPr>
-              <w:t>SHARE + TOUCHPAD</w:t>
-            </w:r>
-          </w:p>
-        </w:tc>
-        <w:tc>
-          <w:tcPr>
-            <w:tcW w:type="dxa" w:w="2880"/>
-          </w:tcPr>
-          <w:p>
-            <w:r>
-              <w:rPr>
-                <w:sz w:val="18"/>
-              </w:rPr>
-              <w:t>Edge (mode record ON)</w:t>
-            </w:r>
-          </w:p>
-        </w:tc>
-        <w:tc>
-          <w:tcPr>
-            <w:tcW w:type="dxa" w:w="2880"/>
-          </w:tcPr>
-          <w:p>
-            <w:r>
-              <w:rPr>
-                <w:sz w:val="18"/>
-              </w:rPr>
-              <w:t>Record odom slot</w:t>
-            </w:r>
-          </w:p>
-        </w:tc>
-      </w:tr>
-      <w:tr>
-        <w:tc>
-          <w:tcPr>
-            <w:tcW w:type="dxa" w:w="2880"/>
-          </w:tcPr>
-          <w:p>
-            <w:r>
-              <w:rPr>
-                <w:sz w:val="18"/>
-              </w:rPr>
               <w:t>OPTIONS</w:t>
             </w:r>
           </w:p>
@@ -859,6 +900,8 @@
                 <w:sz w:val="18"/>
               </w:rPr>
               <w:t>SetupZone1 — servo homing + motor Y level 0 + motor X enc 200</w:t>
+              <w:br/>
+              <w:t>(goto odom hanya jika mode=1)</w:t>
             </w:r>
           </w:p>
         </w:tc>
@@ -904,6 +947,71 @@
           </w:p>
         </w:tc>
       </w:tr>
+    </w:tbl>
+    <w:p>
+      <w:pPr>
+        <w:pStyle w:val="Heading1"/>
+      </w:pPr>
+      <w:r>
+        <w:t>3. Tombol — Mode Otomatis (mode = 1)</w:t>
+      </w:r>
+    </w:p>
+    <w:tbl>
+      <w:tblPr>
+        <w:tblStyle w:val="LightGrid-Accent1"/>
+        <w:tblW w:type="auto" w:w="0"/>
+        <w:jc w:val="left"/>
+        <w:tblLook w:firstColumn="1" w:firstRow="1" w:lastColumn="0" w:lastRow="0" w:noHBand="0" w:noVBand="1" w:val="04A0"/>
+      </w:tblPr>
+      <w:tblGrid>
+        <w:gridCol w:w="2880"/>
+        <w:gridCol w:w="2880"/>
+        <w:gridCol w:w="2880"/>
+      </w:tblGrid>
+      <w:tr>
+        <w:tc>
+          <w:tcPr>
+            <w:tcW w:type="dxa" w:w="2880"/>
+          </w:tcPr>
+          <w:p>
+            <w:r>
+              <w:rPr>
+                <w:b/>
+                <w:sz w:val="18"/>
+              </w:rPr>
+              <w:t>Tombol</w:t>
+            </w:r>
+          </w:p>
+        </w:tc>
+        <w:tc>
+          <w:tcPr>
+            <w:tcW w:type="dxa" w:w="2880"/>
+          </w:tcPr>
+          <w:p>
+            <w:r>
+              <w:rPr>
+                <w:b/>
+                <w:sz w:val="18"/>
+              </w:rPr>
+              <w:t>Edge/Hold</w:t>
+            </w:r>
+          </w:p>
+        </w:tc>
+        <w:tc>
+          <w:tcPr>
+            <w:tcW w:type="dxa" w:w="2880"/>
+          </w:tcPr>
+          <w:p>
+            <w:r>
+              <w:rPr>
+                <w:b/>
+                <w:sz w:val="18"/>
+              </w:rPr>
+              <w:t>Aksi</w:t>
+            </w:r>
+          </w:p>
+        </w:tc>
+      </w:tr>
       <w:tr>
         <w:tc>
           <w:tcPr>
@@ -914,7 +1022,531 @@
               <w:rPr>
                 <w:sz w:val="18"/>
               </w:rPr>
-              <w:t>L3 + R3</w:t>
+              <w:t>Cross</w:t>
+            </w:r>
+          </w:p>
+        </w:tc>
+        <w:tc>
+          <w:tcPr>
+            <w:tcW w:type="dxa" w:w="2880"/>
+          </w:tcPr>
+          <w:p>
+            <w:r>
+              <w:rPr>
+                <w:sz w:val="18"/>
+              </w:rPr>
+              <w:t>—</w:t>
+            </w:r>
+          </w:p>
+        </w:tc>
+        <w:tc>
+          <w:tcPr>
+            <w:tcW w:type="dxa" w:w="2880"/>
+          </w:tcPr>
+          <w:p>
+            <w:r>
+              <w:rPr>
+                <w:sz w:val="18"/>
+              </w:rPr>
+              <w:t>Kosong</w:t>
+            </w:r>
+          </w:p>
+        </w:tc>
+      </w:tr>
+      <w:tr>
+        <w:tc>
+          <w:tcPr>
+            <w:tcW w:type="dxa" w:w="2880"/>
+          </w:tcPr>
+          <w:p>
+            <w:r>
+              <w:rPr>
+                <w:sz w:val="18"/>
+              </w:rPr>
+              <w:t>Circle</w:t>
+            </w:r>
+          </w:p>
+        </w:tc>
+        <w:tc>
+          <w:tcPr>
+            <w:tcW w:type="dxa" w:w="2880"/>
+          </w:tcPr>
+          <w:p>
+            <w:r>
+              <w:rPr>
+                <w:sz w:val="18"/>
+              </w:rPr>
+              <w:t>Hold + arah (edge)</w:t>
+            </w:r>
+          </w:p>
+        </w:tc>
+        <w:tc>
+          <w:tcPr>
+            <w:tcW w:type="dxa" w:w="2880"/>
+          </w:tcPr>
+          <w:p>
+            <w:r>
+              <w:rPr>
+                <w:sz w:val="18"/>
+              </w:rPr>
+              <w:t>Arm box manual:</w:t>
+              <w:br/>
+              <w:t>Kiri→FB toggle R</w:t>
+              <w:br/>
+              <w:t>Kanan→FB toggle L</w:t>
+              <w:br/>
+              <w:t>Atas→done L</w:t>
+              <w:br/>
+              <w:t>Bawah→done R</w:t>
+            </w:r>
+          </w:p>
+        </w:tc>
+      </w:tr>
+      <w:tr>
+        <w:tc>
+          <w:tcPr>
+            <w:tcW w:type="dxa" w:w="2880"/>
+          </w:tcPr>
+          <w:p>
+            <w:r>
+              <w:rPr>
+                <w:sz w:val="18"/>
+              </w:rPr>
+              <w:t>Square</w:t>
+            </w:r>
+          </w:p>
+        </w:tc>
+        <w:tc>
+          <w:tcPr>
+            <w:tcW w:type="dxa" w:w="2880"/>
+          </w:tcPr>
+          <w:p>
+            <w:r>
+              <w:rPr>
+                <w:sz w:val="18"/>
+              </w:rPr>
+              <w:t>Hold</w:t>
+            </w:r>
+          </w:p>
+        </w:tc>
+        <w:tc>
+          <w:tcPr>
+            <w:tcW w:type="dxa" w:w="2880"/>
+          </w:tcPr>
+          <w:p>
+            <w:r>
+              <w:rPr>
+                <w:sz w:val="18"/>
+              </w:rPr>
+              <w:t>Freeze motion (vx=0, vy=0)</w:t>
+            </w:r>
+          </w:p>
+        </w:tc>
+      </w:tr>
+      <w:tr>
+        <w:tc>
+          <w:tcPr>
+            <w:tcW w:type="dxa" w:w="2880"/>
+          </w:tcPr>
+          <w:p>
+            <w:r>
+              <w:rPr>
+                <w:sz w:val="18"/>
+              </w:rPr>
+              <w:t>Triangle</w:t>
+            </w:r>
+          </w:p>
+        </w:tc>
+        <w:tc>
+          <w:tcPr>
+            <w:tcW w:type="dxa" w:w="2880"/>
+          </w:tcPr>
+          <w:p>
+            <w:r>
+              <w:rPr>
+                <w:sz w:val="18"/>
+              </w:rPr>
+              <w:t>Hold</w:t>
+            </w:r>
+          </w:p>
+        </w:tc>
+        <w:tc>
+          <w:tcPr>
+            <w:tcW w:type="dxa" w:w="2880"/>
+          </w:tcPr>
+          <w:p>
+            <w:r>
+              <w:rPr>
+                <w:sz w:val="18"/>
+              </w:rPr>
+              <w:t>Servo B manual (hanya saat READY_TO_STAB)</w:t>
+            </w:r>
+          </w:p>
+        </w:tc>
+      </w:tr>
+      <w:tr>
+        <w:tc>
+          <w:tcPr>
+            <w:tcW w:type="dxa" w:w="2880"/>
+          </w:tcPr>
+          <w:p>
+            <w:r>
+              <w:rPr>
+                <w:sz w:val="18"/>
+              </w:rPr>
+              <w:t>L1</w:t>
+            </w:r>
+          </w:p>
+        </w:tc>
+        <w:tc>
+          <w:tcPr>
+            <w:tcW w:type="dxa" w:w="2880"/>
+          </w:tcPr>
+          <w:p>
+            <w:r>
+              <w:rPr>
+                <w:sz w:val="18"/>
+              </w:rPr>
+              <w:t>Hold</w:t>
+            </w:r>
+          </w:p>
+        </w:tc>
+        <w:tc>
+          <w:tcPr>
+            <w:tcW w:type="dxa" w:w="2880"/>
+          </w:tcPr>
+          <w:p>
+            <w:r>
+              <w:rPr>
+                <w:sz w:val="18"/>
+              </w:rPr>
+              <w:t>Slow — yaw step 150ms, gripper step 5</w:t>
+            </w:r>
+          </w:p>
+        </w:tc>
+      </w:tr>
+      <w:tr>
+        <w:tc>
+          <w:tcPr>
+            <w:tcW w:type="dxa" w:w="2880"/>
+          </w:tcPr>
+          <w:p>
+            <w:r>
+              <w:rPr>
+                <w:sz w:val="18"/>
+              </w:rPr>
+              <w:t>R1</w:t>
+            </w:r>
+          </w:p>
+        </w:tc>
+        <w:tc>
+          <w:tcPr>
+            <w:tcW w:type="dxa" w:w="2880"/>
+          </w:tcPr>
+          <w:p>
+            <w:r>
+              <w:rPr>
+                <w:sz w:val="18"/>
+              </w:rPr>
+              <w:t>Hold</w:t>
+            </w:r>
+          </w:p>
+        </w:tc>
+        <w:tc>
+          <w:tcPr>
+            <w:tcW w:type="dxa" w:w="2880"/>
+          </w:tcPr>
+          <w:p>
+            <w:r>
+              <w:rPr>
+                <w:sz w:val="18"/>
+              </w:rPr>
+              <w:t>Fast — yaw step 25ms, gripper step 40</w:t>
+            </w:r>
+          </w:p>
+        </w:tc>
+      </w:tr>
+      <w:tr>
+        <w:tc>
+          <w:tcPr>
+            <w:tcW w:type="dxa" w:w="2880"/>
+          </w:tcPr>
+          <w:p>
+            <w:r>
+              <w:rPr>
+                <w:sz w:val="18"/>
+              </w:rPr>
+              <w:t>L2 + analog kanan</w:t>
+            </w:r>
+          </w:p>
+        </w:tc>
+        <w:tc>
+          <w:tcPr>
+            <w:tcW w:type="dxa" w:w="2880"/>
+          </w:tcPr>
+          <w:p>
+            <w:r>
+              <w:rPr>
+                <w:sz w:val="18"/>
+              </w:rPr>
+              <w:t>Hold</w:t>
+            </w:r>
+          </w:p>
+        </w:tc>
+        <w:tc>
+          <w:tcPr>
+            <w:tcW w:type="dxa" w:w="2880"/>
+          </w:tcPr>
+          <w:p>
+            <w:r>
+              <w:rPr>
+                <w:sz w:val="18"/>
+              </w:rPr>
+              <w:t>Yaw snap kardinal (0°/90°/180°/-90°)</w:t>
+            </w:r>
+          </w:p>
+        </w:tc>
+      </w:tr>
+      <w:tr>
+        <w:tc>
+          <w:tcPr>
+            <w:tcW w:type="dxa" w:w="2880"/>
+          </w:tcPr>
+          <w:p>
+            <w:r>
+              <w:rPr>
+                <w:sz w:val="18"/>
+              </w:rPr>
+              <w:t>L2 + R2</w:t>
+            </w:r>
+          </w:p>
+        </w:tc>
+        <w:tc>
+          <w:tcPr>
+            <w:tcW w:type="dxa" w:w="2880"/>
+          </w:tcPr>
+          <w:p>
+            <w:r>
+              <w:rPr>
+                <w:sz w:val="18"/>
+              </w:rPr>
+              <w:t>Analog ≥250</w:t>
+            </w:r>
+          </w:p>
+        </w:tc>
+        <w:tc>
+          <w:tcPr>
+            <w:tcW w:type="dxa" w:w="2880"/>
+          </w:tcPr>
+          <w:p>
+            <w:r>
+              <w:rPr>
+                <w:sz w:val="18"/>
+              </w:rPr>
+              <w:t>Flash lamp fire</w:t>
+            </w:r>
+          </w:p>
+        </w:tc>
+      </w:tr>
+      <w:tr>
+        <w:tc>
+          <w:tcPr>
+            <w:tcW w:type="dxa" w:w="2880"/>
+          </w:tcPr>
+          <w:p>
+            <w:r>
+              <w:rPr>
+                <w:sz w:val="18"/>
+              </w:rPr>
+              <w:t>R2</w:t>
+            </w:r>
+          </w:p>
+        </w:tc>
+        <w:tc>
+          <w:tcPr>
+            <w:tcW w:type="dxa" w:w="2880"/>
+          </w:tcPr>
+          <w:p>
+            <w:r>
+              <w:rPr>
+                <w:sz w:val="18"/>
+              </w:rPr>
+              <w:t>Hold</w:t>
+            </w:r>
+          </w:p>
+        </w:tc>
+        <w:tc>
+          <w:tcPr>
+            <w:tcW w:type="dxa" w:w="2880"/>
+          </w:tcPr>
+          <w:p>
+            <w:r>
+              <w:rPr>
+                <w:sz w:val="18"/>
+              </w:rPr>
+              <w:t>Gripper mode — motor X/Y (analog kanan) + armbox Y jog (analog kiri/DPAD)</w:t>
+            </w:r>
+          </w:p>
+        </w:tc>
+      </w:tr>
+      <w:tr>
+        <w:tc>
+          <w:tcPr>
+            <w:tcW w:type="dxa" w:w="2880"/>
+          </w:tcPr>
+          <w:p>
+            <w:r>
+              <w:rPr>
+                <w:sz w:val="18"/>
+              </w:rPr>
+              <w:t>OPTIONS</w:t>
+            </w:r>
+          </w:p>
+        </w:tc>
+        <w:tc>
+          <w:tcPr>
+            <w:tcW w:type="dxa" w:w="2880"/>
+          </w:tcPr>
+          <w:p>
+            <w:r>
+              <w:rPr>
+                <w:sz w:val="18"/>
+              </w:rPr>
+              <w:t>Edge (zone 1)</w:t>
+            </w:r>
+          </w:p>
+        </w:tc>
+        <w:tc>
+          <w:tcPr>
+            <w:tcW w:type="dxa" w:w="2880"/>
+          </w:tcPr>
+          <w:p>
+            <w:r>
+              <w:rPr>
+                <w:sz w:val="18"/>
+              </w:rPr>
+              <w:t>SetupZone1 — servo homing + odomGoto(1) + motor Y level 0 + motor X enc 200</w:t>
+            </w:r>
+          </w:p>
+        </w:tc>
+      </w:tr>
+      <w:tr>
+        <w:tc>
+          <w:tcPr>
+            <w:tcW w:type="dxa" w:w="2880"/>
+          </w:tcPr>
+          <w:p>
+            <w:r>
+              <w:rPr>
+                <w:sz w:val="18"/>
+              </w:rPr>
+              <w:t>OPTIONS</w:t>
+            </w:r>
+          </w:p>
+        </w:tc>
+        <w:tc>
+          <w:tcPr>
+            <w:tcW w:type="dxa" w:w="2880"/>
+          </w:tcPr>
+          <w:p>
+            <w:r>
+              <w:rPr>
+                <w:sz w:val="18"/>
+              </w:rPr>
+              <w:t>Edge (zone 2)</w:t>
+            </w:r>
+          </w:p>
+        </w:tc>
+        <w:tc>
+          <w:tcPr>
+            <w:tcW w:type="dxa" w:w="2880"/>
+          </w:tcPr>
+          <w:p>
+            <w:r>
+              <w:rPr>
+                <w:sz w:val="18"/>
+              </w:rPr>
+              <w:t>Toggle modeKinematics (goto ↔ kn)</w:t>
+            </w:r>
+          </w:p>
+        </w:tc>
+      </w:tr>
+    </w:tbl>
+    <w:p>
+      <w:pPr>
+        <w:pStyle w:val="Heading1"/>
+      </w:pPr>
+      <w:r>
+        <w:t>4. Input Mode &amp; Misc</w:t>
+      </w:r>
+    </w:p>
+    <w:tbl>
+      <w:tblPr>
+        <w:tblStyle w:val="LightGrid-Accent1"/>
+        <w:tblW w:type="auto" w:w="0"/>
+        <w:jc w:val="left"/>
+        <w:tblLook w:firstColumn="1" w:firstRow="1" w:lastColumn="0" w:lastRow="0" w:noHBand="0" w:noVBand="1" w:val="04A0"/>
+      </w:tblPr>
+      <w:tblGrid>
+        <w:gridCol w:w="2880"/>
+        <w:gridCol w:w="2880"/>
+        <w:gridCol w:w="2880"/>
+      </w:tblGrid>
+      <w:tr>
+        <w:tc>
+          <w:tcPr>
+            <w:tcW w:type="dxa" w:w="2880"/>
+          </w:tcPr>
+          <w:p>
+            <w:r>
+              <w:rPr>
+                <w:b/>
+                <w:sz w:val="18"/>
+              </w:rPr>
+              <w:t>Tombol</w:t>
+            </w:r>
+          </w:p>
+        </w:tc>
+        <w:tc>
+          <w:tcPr>
+            <w:tcW w:type="dxa" w:w="2880"/>
+          </w:tcPr>
+          <w:p>
+            <w:r>
+              <w:rPr>
+                <w:b/>
+                <w:sz w:val="18"/>
+              </w:rPr>
+              <w:t>Edge/Hold</w:t>
+            </w:r>
+          </w:p>
+        </w:tc>
+        <w:tc>
+          <w:tcPr>
+            <w:tcW w:type="dxa" w:w="2880"/>
+          </w:tcPr>
+          <w:p>
+            <w:r>
+              <w:rPr>
+                <w:b/>
+                <w:sz w:val="18"/>
+              </w:rPr>
+              <w:t>Aksi</w:t>
+            </w:r>
+          </w:p>
+        </w:tc>
+      </w:tr>
+      <w:tr>
+        <w:tc>
+          <w:tcPr>
+            <w:tcW w:type="dxa" w:w="2880"/>
+          </w:tcPr>
+          <w:p>
+            <w:r>
+              <w:rPr>
+                <w:sz w:val="18"/>
+              </w:rPr>
+              <w:t>SHARE</w:t>
             </w:r>
           </w:p>
         </w:tc>
@@ -940,7 +1572,9 @@
               <w:rPr>
                 <w:sz w:val="18"/>
               </w:rPr>
-              <w:t>Keluar mode record odom</w:t>
+              <w:t>Toggle input mode (DPAD ↔ ANALOG)</w:t>
+              <w:br/>
+              <w:t>(diblok saat odom record ON)</w:t>
             </w:r>
           </w:p>
         </w:tc>
@@ -1033,7 +1667,85 @@
         <w:pStyle w:val="Heading1"/>
       </w:pPr>
       <w:r>
-        <w:t>3. Odom Record Combos (mode record ON)</w:t>
+        <w:t>5. Odom Record</w:t>
+      </w:r>
+    </w:p>
+    <w:tbl>
+      <w:tblPr>
+        <w:tblStyle w:val="LightGrid-Accent1"/>
+        <w:tblW w:type="auto" w:w="0"/>
+        <w:jc w:val="left"/>
+        <w:tblLook w:firstColumn="1" w:firstRow="1" w:lastColumn="0" w:lastRow="0" w:noHBand="0" w:noVBand="1" w:val="04A0"/>
+      </w:tblPr>
+      <w:tblGrid>
+        <w:gridCol w:w="4320"/>
+        <w:gridCol w:w="4320"/>
+      </w:tblGrid>
+      <w:tr>
+        <w:tc>
+          <w:tcPr>
+            <w:tcW w:type="dxa" w:w="4320"/>
+          </w:tcPr>
+          <w:p>
+            <w:r>
+              <w:rPr>
+                <w:b/>
+                <w:sz w:val="18"/>
+              </w:rPr>
+              <w:t>Tombol</w:t>
+            </w:r>
+          </w:p>
+        </w:tc>
+        <w:tc>
+          <w:tcPr>
+            <w:tcW w:type="dxa" w:w="4320"/>
+          </w:tcPr>
+          <w:p>
+            <w:r>
+              <w:rPr>
+                <w:b/>
+                <w:sz w:val="18"/>
+              </w:rPr>
+              <w:t>Aksi</w:t>
+            </w:r>
+          </w:p>
+        </w:tc>
+      </w:tr>
+      <w:tr>
+        <w:tc>
+          <w:tcPr>
+            <w:tcW w:type="dxa" w:w="4320"/>
+          </w:tcPr>
+          <w:p>
+            <w:r>
+              <w:rPr>
+                <w:sz w:val="18"/>
+              </w:rPr>
+              <w:t>R3 + L3</w:t>
+            </w:r>
+          </w:p>
+        </w:tc>
+        <w:tc>
+          <w:tcPr>
+            <w:tcW w:type="dxa" w:w="4320"/>
+          </w:tcPr>
+          <w:p>
+            <w:r>
+              <w:rPr>
+                <w:sz w:val="18"/>
+              </w:rPr>
+              <w:t>Toggle mode record ON/OFF (press, tanpa hold)</w:t>
+            </w:r>
+          </w:p>
+        </w:tc>
+      </w:tr>
+    </w:tbl>
+    <w:p>
+      <w:pPr>
+        <w:pStyle w:val="Heading2"/>
+      </w:pPr>
+      <w:r>
+        <w:t>Odom Record Combos (mode record ON)</w:t>
       </w:r>
     </w:p>
     <w:tbl>
@@ -1419,7 +2131,121 @@
         <w:pStyle w:val="Heading1"/>
       </w:pPr>
       <w:r>
-        <w:t>4. Speed &amp; Interval</w:t>
+        <w:t>6. Controller Mode (hardware)</w:t>
+      </w:r>
+    </w:p>
+    <w:tbl>
+      <w:tblPr>
+        <w:tblStyle w:val="LightGrid-Accent1"/>
+        <w:tblW w:type="auto" w:w="0"/>
+        <w:jc w:val="left"/>
+        <w:tblLook w:firstColumn="1" w:firstRow="1" w:lastColumn="0" w:lastRow="0" w:noHBand="0" w:noVBand="1" w:val="04A0"/>
+      </w:tblPr>
+      <w:tblGrid>
+        <w:gridCol w:w="4320"/>
+        <w:gridCol w:w="4320"/>
+      </w:tblGrid>
+      <w:tr>
+        <w:tc>
+          <w:tcPr>
+            <w:tcW w:type="dxa" w:w="4320"/>
+          </w:tcPr>
+          <w:p>
+            <w:r>
+              <w:rPr>
+                <w:b/>
+                <w:sz w:val="18"/>
+              </w:rPr>
+              <w:t>Hardware</w:t>
+            </w:r>
+          </w:p>
+        </w:tc>
+        <w:tc>
+          <w:tcPr>
+            <w:tcW w:type="dxa" w:w="4320"/>
+          </w:tcPr>
+          <w:p>
+            <w:r>
+              <w:rPr>
+                <w:b/>
+                <w:sz w:val="18"/>
+              </w:rPr>
+              <w:t>Aksi</w:t>
+            </w:r>
+          </w:p>
+        </w:tc>
+      </w:tr>
+      <w:tr>
+        <w:tc>
+          <w:tcPr>
+            <w:tcW w:type="dxa" w:w="4320"/>
+          </w:tcPr>
+          <w:p>
+            <w:r>
+              <w:rPr>
+                <w:sz w:val="18"/>
+              </w:rPr>
+              <w:t>BOOT button (controller) — double-press 200ms</w:t>
+            </w:r>
+          </w:p>
+        </w:tc>
+        <w:tc>
+          <w:tcPr>
+            <w:tcW w:type="dxa" w:w="4320"/>
+          </w:tcPr>
+          <w:p>
+            <w:r>
+              <w:rPr>
+                <w:sz w:val="18"/>
+              </w:rPr>
+              <w:t>Toggle mode 0 (manual) ↔ 1 (auto)</w:t>
+              <w:br/>
+              <w:t>LED: putih=auto, coklat=manual</w:t>
+              <w:br/>
+              <w:t>Tersimpan ke NVS</w:t>
+            </w:r>
+          </w:p>
+        </w:tc>
+      </w:tr>
+      <w:tr>
+        <w:tc>
+          <w:tcPr>
+            <w:tcW w:type="dxa" w:w="4320"/>
+          </w:tcPr>
+          <w:p>
+            <w:r>
+              <w:rPr>
+                <w:sz w:val="18"/>
+              </w:rPr>
+              <w:t>BOOT button (master) — double-press 200ms</w:t>
+            </w:r>
+          </w:p>
+        </w:tc>
+        <w:tc>
+          <w:tcPr>
+            <w:tcW w:type="dxa" w:w="4320"/>
+          </w:tcPr>
+          <w:p>
+            <w:r>
+              <w:rPr>
+                <w:sz w:val="18"/>
+              </w:rPr>
+              <w:t>Toggle alliance RED ↔ BLUE</w:t>
+              <w:br/>
+              <w:t>LED: merah=RED, biru=BLUE</w:t>
+              <w:br/>
+              <w:t>Tersimpan ke NVS</w:t>
+            </w:r>
+          </w:p>
+        </w:tc>
+      </w:tr>
+    </w:tbl>
+    <w:p>
+      <w:pPr>
+        <w:pStyle w:val="Heading1"/>
+      </w:pPr>
+      <w:r>
+        <w:t>7. Speed &amp; Interval</w:t>
       </w:r>
     </w:p>
     <w:tbl>
@@ -1583,7 +2409,7 @@
               <w:rPr>
                 <w:sz w:val="18"/>
               </w:rPr>
-              <w:t>100ms</w:t>
+              <w:t>20ms</w:t>
             </w:r>
           </w:p>
         </w:tc>
@@ -1637,7 +2463,7 @@
               <w:rPr>
                 <w:sz w:val="18"/>
               </w:rPr>
-              <w:t>5ms</w:t>
+              <w:t>20ms</w:t>
             </w:r>
           </w:p>
         </w:tc>
@@ -1661,7 +2487,7 @@
         <w:pStyle w:val="Heading1"/>
       </w:pPr>
       <w:r>
-        <w:t>5. Mode Behavior</w:t>
+        <w:t>8. Mode Behavior</w:t>
       </w:r>
     </w:p>
     <w:tbl>
@@ -1824,7 +2650,7 @@
         <w:pStyle w:val="Heading1"/>
       </w:pPr>
       <w:r>
-        <w:t>6. Auto (tanpa tombol)</w:t>
+        <w:t>9. Auto (tanpa tombol)</w:t>
       </w:r>
     </w:p>
     <w:tbl>
@@ -1990,7 +2816,7 @@
               <w:rPr>
                 <w:sz w:val="18"/>
               </w:rPr>
-              <w:t>BOOT button</w:t>
+              <w:t>Proximity gripper (auto)</w:t>
             </w:r>
           </w:p>
         </w:tc>
@@ -2003,7 +2829,225 @@
               <w:rPr>
                 <w:sz w:val="18"/>
               </w:rPr>
-              <w:t>Toggle alliance BLUE ↔ RED (NVS)</w:t>
+              <w:t>IDLE → CLOSING → UP → STRAIGHTEN → READY_TO_STAB</w:t>
+            </w:r>
+          </w:p>
+        </w:tc>
+      </w:tr>
+    </w:tbl>
+    <w:p>
+      <w:pPr>
+        <w:pStyle w:val="Heading1"/>
+      </w:pPr>
+      <w:r>
+        <w:t>10. Motor Y Level (default)</w:t>
+      </w:r>
+    </w:p>
+    <w:tbl>
+      <w:tblPr>
+        <w:tblStyle w:val="LightGrid-Accent1"/>
+        <w:tblW w:type="auto" w:w="0"/>
+        <w:jc w:val="left"/>
+        <w:tblLook w:firstColumn="1" w:firstRow="1" w:lastColumn="0" w:lastRow="0" w:noHBand="0" w:noVBand="1" w:val="04A0"/>
+      </w:tblPr>
+      <w:tblGrid>
+        <w:gridCol w:w="4320"/>
+        <w:gridCol w:w="4320"/>
+      </w:tblGrid>
+      <w:tr>
+        <w:tc>
+          <w:tcPr>
+            <w:tcW w:type="dxa" w:w="4320"/>
+          </w:tcPr>
+          <w:p>
+            <w:r>
+              <w:rPr>
+                <w:b/>
+                <w:sz w:val="18"/>
+              </w:rPr>
+              <w:t>Level</w:t>
+            </w:r>
+          </w:p>
+        </w:tc>
+        <w:tc>
+          <w:tcPr>
+            <w:tcW w:type="dxa" w:w="4320"/>
+          </w:tcPr>
+          <w:p>
+            <w:r>
+              <w:rPr>
+                <w:b/>
+                <w:sz w:val="18"/>
+              </w:rPr>
+              <w:t>Encoder pulse</w:t>
+            </w:r>
+          </w:p>
+        </w:tc>
+      </w:tr>
+      <w:tr>
+        <w:tc>
+          <w:tcPr>
+            <w:tcW w:type="dxa" w:w="4320"/>
+          </w:tcPr>
+          <w:p>
+            <w:r>
+              <w:rPr>
+                <w:sz w:val="18"/>
+              </w:rPr>
+              <w:t>0</w:t>
+            </w:r>
+          </w:p>
+        </w:tc>
+        <w:tc>
+          <w:tcPr>
+            <w:tcW w:type="dxa" w:w="4320"/>
+          </w:tcPr>
+          <w:p>
+            <w:r>
+              <w:rPr>
+                <w:sz w:val="18"/>
+              </w:rPr>
+              <w:t>0</w:t>
+            </w:r>
+          </w:p>
+        </w:tc>
+      </w:tr>
+      <w:tr>
+        <w:tc>
+          <w:tcPr>
+            <w:tcW w:type="dxa" w:w="4320"/>
+          </w:tcPr>
+          <w:p>
+            <w:r>
+              <w:rPr>
+                <w:sz w:val="18"/>
+              </w:rPr>
+              <w:t>1</w:t>
+            </w:r>
+          </w:p>
+        </w:tc>
+        <w:tc>
+          <w:tcPr>
+            <w:tcW w:type="dxa" w:w="4320"/>
+          </w:tcPr>
+          <w:p>
+            <w:r>
+              <w:rPr>
+                <w:sz w:val="18"/>
+              </w:rPr>
+              <w:t>300</w:t>
+            </w:r>
+          </w:p>
+        </w:tc>
+      </w:tr>
+      <w:tr>
+        <w:tc>
+          <w:tcPr>
+            <w:tcW w:type="dxa" w:w="4320"/>
+          </w:tcPr>
+          <w:p>
+            <w:r>
+              <w:rPr>
+                <w:sz w:val="18"/>
+              </w:rPr>
+              <w:t>2</w:t>
+            </w:r>
+          </w:p>
+        </w:tc>
+        <w:tc>
+          <w:tcPr>
+            <w:tcW w:type="dxa" w:w="4320"/>
+          </w:tcPr>
+          <w:p>
+            <w:r>
+              <w:rPr>
+                <w:sz w:val="18"/>
+              </w:rPr>
+              <w:t>600</w:t>
+            </w:r>
+          </w:p>
+        </w:tc>
+      </w:tr>
+      <w:tr>
+        <w:tc>
+          <w:tcPr>
+            <w:tcW w:type="dxa" w:w="4320"/>
+          </w:tcPr>
+          <w:p>
+            <w:r>
+              <w:rPr>
+                <w:sz w:val="18"/>
+              </w:rPr>
+              <w:t>3</w:t>
+            </w:r>
+          </w:p>
+        </w:tc>
+        <w:tc>
+          <w:tcPr>
+            <w:tcW w:type="dxa" w:w="4320"/>
+          </w:tcPr>
+          <w:p>
+            <w:r>
+              <w:rPr>
+                <w:sz w:val="18"/>
+              </w:rPr>
+              <w:t>900</w:t>
+            </w:r>
+          </w:p>
+        </w:tc>
+      </w:tr>
+      <w:tr>
+        <w:tc>
+          <w:tcPr>
+            <w:tcW w:type="dxa" w:w="4320"/>
+          </w:tcPr>
+          <w:p>
+            <w:r>
+              <w:rPr>
+                <w:sz w:val="18"/>
+              </w:rPr>
+              <w:t>4</w:t>
+            </w:r>
+          </w:p>
+        </w:tc>
+        <w:tc>
+          <w:tcPr>
+            <w:tcW w:type="dxa" w:w="4320"/>
+          </w:tcPr>
+          <w:p>
+            <w:r>
+              <w:rPr>
+                <w:sz w:val="18"/>
+              </w:rPr>
+              <w:t>1200</w:t>
+            </w:r>
+          </w:p>
+        </w:tc>
+      </w:tr>
+      <w:tr>
+        <w:tc>
+          <w:tcPr>
+            <w:tcW w:type="dxa" w:w="4320"/>
+          </w:tcPr>
+          <w:p>
+            <w:r>
+              <w:rPr>
+                <w:sz w:val="18"/>
+              </w:rPr>
+              <w:t>5</w:t>
+            </w:r>
+          </w:p>
+        </w:tc>
+        <w:tc>
+          <w:tcPr>
+            <w:tcW w:type="dxa" w:w="4320"/>
+          </w:tcPr>
+          <w:p>
+            <w:r>
+              <w:rPr>
+                <w:sz w:val="18"/>
+              </w:rPr>
+              <w:t>1500</w:t>
             </w:r>
           </w:p>
         </w:tc>

</xml_diff>

<commit_message>
fix: update motor and pneumatic pin configurations for correct functionality; enhance button mapping documentation
</commit_message>
<xml_diff>
--- a/KRAI2026Manual/Button_Mapping_KRAI2026.docx
+++ b/KRAI2026Manual/Button_Mapping_KRAI2026.docx
@@ -345,7 +345,7 @@
               <w:rPr>
                 <w:sz w:val="18"/>
               </w:rPr>
-              <w:t>—</w:t>
+              <w:t>Edge (tanpa L2)</w:t>
             </w:r>
           </w:p>
         </w:tc>
@@ -358,7 +358,7 @@
               <w:rPr>
                 <w:sz w:val="18"/>
               </w:rPr>
-              <w:t>Kosong</w:t>
+              <w:t>Toggle servo B (0° ↔ 90°)</w:t>
             </w:r>
           </w:p>
         </w:tc>
@@ -401,9 +401,9 @@
               </w:rPr>
               <w:t>Arm box manual:</w:t>
               <w:br/>
-              <w:t>Kiri→FB toggle R</w:t>
+              <w:t>Kanan→FB toggle R</w:t>
               <w:br/>
-              <w:t>Kanan→FB toggle L</w:t>
+              <w:t>Kiri→FB toggle L</w:t>
               <w:br/>
               <w:t>Atas→done L</w:t>
               <w:br/>
@@ -489,7 +489,9 @@
               <w:rPr>
                 <w:sz w:val="18"/>
               </w:rPr>
-              <w:t>Servo B manual (hanya saat READY_TO_STAB)</w:t>
+              <w:t>Servo B manual (step ±5/10/20°)</w:t>
+              <w:br/>
+              <w:t>Input: analog kiri LY (inverted)</w:t>
             </w:r>
           </w:p>
         </w:tc>
@@ -627,6 +629,47 @@
               <w:rPr>
                 <w:sz w:val="18"/>
               </w:rPr>
+              <w:t>L2 + Cross</w:t>
+            </w:r>
+          </w:p>
+        </w:tc>
+        <w:tc>
+          <w:tcPr>
+            <w:tcW w:type="dxa" w:w="2880"/>
+          </w:tcPr>
+          <w:p>
+            <w:r>
+              <w:rPr>
+                <w:sz w:val="18"/>
+              </w:rPr>
+              <w:t>Edge</w:t>
+            </w:r>
+          </w:p>
+        </w:tc>
+        <w:tc>
+          <w:tcPr>
+            <w:tcW w:type="dxa" w:w="2880"/>
+          </w:tcPr>
+          <w:p>
+            <w:r>
+              <w:rPr>
+                <w:sz w:val="18"/>
+              </w:rPr>
+              <w:t>User-defined action (armBox_control)</w:t>
+            </w:r>
+          </w:p>
+        </w:tc>
+      </w:tr>
+      <w:tr>
+        <w:tc>
+          <w:tcPr>
+            <w:tcW w:type="dxa" w:w="2880"/>
+          </w:tcPr>
+          <w:p>
+            <w:r>
+              <w:rPr>
+                <w:sz w:val="18"/>
+              </w:rPr>
               <w:t>L2 + Circle + analog kiri ke kanan</w:t>
             </w:r>
           </w:p>
@@ -653,7 +696,7 @@
               <w:rPr>
                 <w:sz w:val="18"/>
               </w:rPr>
-              <w:t>Arm box R: pne ON → ARMBOX_WAIT</w:t>
+              <w:t>Arm box R: pne r + rk ON → ARMBOX_WAIT</w:t>
             </w:r>
           </w:p>
         </w:tc>
@@ -694,7 +737,7 @@
               <w:rPr>
                 <w:sz w:val="18"/>
               </w:rPr>
-              <w:t>Arm box L: pne ON → ARMBOX_WAIT</w:t>
+              <w:t>Arm box L: pne l + lk ON → ARMBOX_WAIT</w:t>
             </w:r>
           </w:p>
         </w:tc>
@@ -735,7 +778,7 @@
               <w:rPr>
                 <w:sz w:val="18"/>
               </w:rPr>
-              <w:t>User-defined action (armbox_control)</w:t>
+              <w:t>Armbox: motor Y level 4 + arm L/R -500 + pne all ON</w:t>
             </w:r>
           </w:p>
         </w:tc>
@@ -873,7 +916,7 @@
               <w:rPr>
                 <w:sz w:val="18"/>
               </w:rPr>
-              <w:t>OPTIONS</w:t>
+              <w:t>OPTIONS (zone 1)</w:t>
             </w:r>
           </w:p>
         </w:tc>
@@ -886,7 +929,7 @@
               <w:rPr>
                 <w:sz w:val="18"/>
               </w:rPr>
-              <w:t>Edge (zone 1)</w:t>
+              <w:t>Edge</w:t>
             </w:r>
           </w:p>
         </w:tc>
@@ -900,8 +943,6 @@
                 <w:sz w:val="18"/>
               </w:rPr>
               <w:t>SetupZone1 — servo homing + motor Y level 0 + motor X enc 200</w:t>
-              <w:br/>
-              <w:t>(goto odom hanya jika mode=1)</w:t>
             </w:r>
           </w:p>
         </w:tc>
@@ -916,7 +957,7 @@
               <w:rPr>
                 <w:sz w:val="18"/>
               </w:rPr>
-              <w:t>OPTIONS</w:t>
+              <w:t>OPTIONS (zone 2) + lx kanan</w:t>
             </w:r>
           </w:p>
         </w:tc>
@@ -929,7 +970,7 @@
               <w:rPr>
                 <w:sz w:val="18"/>
               </w:rPr>
-              <w:t>Edge (zone 2)</w:t>
+              <w:t>Edge</w:t>
             </w:r>
           </w:p>
         </w:tc>
@@ -942,7 +983,48 @@
               <w:rPr>
                 <w:sz w:val="18"/>
               </w:rPr>
-              <w:t>Toggle modeKinematics (goto ↔ kn)</w:t>
+              <w:t>Motor Y level 4 + arm R -500 + pne r + rk ON + armBoxRReset</w:t>
+            </w:r>
+          </w:p>
+        </w:tc>
+      </w:tr>
+      <w:tr>
+        <w:tc>
+          <w:tcPr>
+            <w:tcW w:type="dxa" w:w="2880"/>
+          </w:tcPr>
+          <w:p>
+            <w:r>
+              <w:rPr>
+                <w:sz w:val="18"/>
+              </w:rPr>
+              <w:t>OPTIONS (zone 2) + lx kiri</w:t>
+            </w:r>
+          </w:p>
+        </w:tc>
+        <w:tc>
+          <w:tcPr>
+            <w:tcW w:type="dxa" w:w="2880"/>
+          </w:tcPr>
+          <w:p>
+            <w:r>
+              <w:rPr>
+                <w:sz w:val="18"/>
+              </w:rPr>
+              <w:t>Edge</w:t>
+            </w:r>
+          </w:p>
+        </w:tc>
+        <w:tc>
+          <w:tcPr>
+            <w:tcW w:type="dxa" w:w="2880"/>
+          </w:tcPr>
+          <w:p>
+            <w:r>
+              <w:rPr>
+                <w:sz w:val="18"/>
+              </w:rPr>
+              <w:t>Motor Y level 4 + arm L -500 + pne l + lk ON + armBoxLReset</w:t>
             </w:r>
           </w:p>
         </w:tc>
@@ -1035,7 +1117,7 @@
               <w:rPr>
                 <w:sz w:val="18"/>
               </w:rPr>
-              <w:t>—</w:t>
+              <w:t>Edge (tanpa L2)</w:t>
             </w:r>
           </w:p>
         </w:tc>
@@ -1048,7 +1130,7 @@
               <w:rPr>
                 <w:sz w:val="18"/>
               </w:rPr>
-              <w:t>Kosong</w:t>
+              <w:t>Toggle servo B (0° ↔ 90°)</w:t>
             </w:r>
           </w:p>
         </w:tc>
@@ -1091,9 +1173,9 @@
               </w:rPr>
               <w:t>Arm box manual:</w:t>
               <w:br/>
-              <w:t>Kiri→FB toggle R</w:t>
+              <w:t>Kanan→FB toggle R</w:t>
               <w:br/>
-              <w:t>Kanan→FB toggle L</w:t>
+              <w:t>Kiri→FB toggle L</w:t>
               <w:br/>
               <w:t>Atas→done L</w:t>
               <w:br/>
@@ -1179,7 +1261,9 @@
               <w:rPr>
                 <w:sz w:val="18"/>
               </w:rPr>
-              <w:t>Servo B manual (hanya saat READY_TO_STAB)</w:t>
+              <w:t>Servo B manual (step ±5/10/20°)</w:t>
+              <w:br/>
+              <w:t>Input: analog kiri LY (inverted)</w:t>
             </w:r>
           </w:p>
         </w:tc>
@@ -1399,7 +1483,7 @@
               <w:rPr>
                 <w:sz w:val="18"/>
               </w:rPr>
-              <w:t>OPTIONS</w:t>
+              <w:t>OPTIONS (zone 1)</w:t>
             </w:r>
           </w:p>
         </w:tc>
@@ -1412,7 +1496,7 @@
               <w:rPr>
                 <w:sz w:val="18"/>
               </w:rPr>
-              <w:t>Edge (zone 1)</w:t>
+              <w:t>Edge</w:t>
             </w:r>
           </w:p>
         </w:tc>
@@ -1440,7 +1524,7 @@
               <w:rPr>
                 <w:sz w:val="18"/>
               </w:rPr>
-              <w:t>OPTIONS</w:t>
+              <w:t>OPTIONS (zone 2) + lx kanan</w:t>
             </w:r>
           </w:p>
         </w:tc>
@@ -1453,7 +1537,7 @@
               <w:rPr>
                 <w:sz w:val="18"/>
               </w:rPr>
-              <w:t>Edge (zone 2)</w:t>
+              <w:t>Edge</w:t>
             </w:r>
           </w:p>
         </w:tc>
@@ -1466,7 +1550,48 @@
               <w:rPr>
                 <w:sz w:val="18"/>
               </w:rPr>
-              <w:t>Toggle modeKinematics (goto ↔ kn)</w:t>
+              <w:t>Motor Y level 4 + arm R -500 + pne r + rk ON + armBoxRReset</w:t>
+            </w:r>
+          </w:p>
+        </w:tc>
+      </w:tr>
+      <w:tr>
+        <w:tc>
+          <w:tcPr>
+            <w:tcW w:type="dxa" w:w="2880"/>
+          </w:tcPr>
+          <w:p>
+            <w:r>
+              <w:rPr>
+                <w:sz w:val="18"/>
+              </w:rPr>
+              <w:t>OPTIONS (zone 2) + lx kiri</w:t>
+            </w:r>
+          </w:p>
+        </w:tc>
+        <w:tc>
+          <w:tcPr>
+            <w:tcW w:type="dxa" w:w="2880"/>
+          </w:tcPr>
+          <w:p>
+            <w:r>
+              <w:rPr>
+                <w:sz w:val="18"/>
+              </w:rPr>
+              <w:t>Edge</w:t>
+            </w:r>
+          </w:p>
+        </w:tc>
+        <w:tc>
+          <w:tcPr>
+            <w:tcW w:type="dxa" w:w="2880"/>
+          </w:tcPr>
+          <w:p>
+            <w:r>
+              <w:rPr>
+                <w:sz w:val="18"/>
+              </w:rPr>
+              <w:t>Motor Y level 4 + arm L -500 + pne l + lk ON + armBoxLReset</w:t>
             </w:r>
           </w:p>
         </w:tc>
@@ -2717,7 +2842,7 @@
               <w:rPr>
                 <w:sz w:val="18"/>
               </w:rPr>
-              <w:t>Arm box R: pne ON → motor Y level 4 + motor X -255 → grab</w:t>
+              <w:t>Arm box R: pne r + rk ON → motor Y level 4 + motor X -255 → grab</w:t>
             </w:r>
           </w:p>
         </w:tc>
@@ -2745,7 +2870,7 @@
               <w:rPr>
                 <w:sz w:val="18"/>
               </w:rPr>
-              <w:t>Arm box L: pne ON → motor Y level 4 + motor K -255 → grab</w:t>
+              <w:t>Arm box L: pne l + lk ON → motor Y level 4 + motor K -255 → grab</w:t>
             </w:r>
           </w:p>
         </w:tc>
@@ -3048,6 +3173,397 @@
                 <w:sz w:val="18"/>
               </w:rPr>
               <w:t>1500</w:t>
+            </w:r>
+          </w:p>
+        </w:tc>
+      </w:tr>
+      <w:tr>
+        <w:tc>
+          <w:tcPr>
+            <w:tcW w:type="dxa" w:w="4320"/>
+          </w:tcPr>
+          <w:p>
+            <w:r>
+              <w:rPr>
+                <w:sz w:val="18"/>
+              </w:rPr>
+              <w:t>6</w:t>
+            </w:r>
+          </w:p>
+        </w:tc>
+        <w:tc>
+          <w:tcPr>
+            <w:tcW w:type="dxa" w:w="4320"/>
+          </w:tcPr>
+          <w:p>
+            <w:r>
+              <w:rPr>
+                <w:sz w:val="18"/>
+              </w:rPr>
+              <w:t>1800</w:t>
+            </w:r>
+          </w:p>
+        </w:tc>
+      </w:tr>
+    </w:tbl>
+    <w:p>
+      <w:pPr>
+        <w:pStyle w:val="Heading1"/>
+      </w:pPr>
+      <w:r>
+        <w:t>11. Pneumatic (Slave2 Arm)</w:t>
+      </w:r>
+    </w:p>
+    <w:tbl>
+      <w:tblPr>
+        <w:tblStyle w:val="LightGrid-Accent1"/>
+        <w:tblW w:type="auto" w:w="0"/>
+        <w:jc w:val="left"/>
+        <w:tblLook w:firstColumn="1" w:firstRow="1" w:lastColumn="0" w:lastRow="0" w:noHBand="0" w:noVBand="1" w:val="04A0"/>
+      </w:tblPr>
+      <w:tblGrid>
+        <w:gridCol w:w="2880"/>
+        <w:gridCol w:w="2880"/>
+        <w:gridCol w:w="2880"/>
+      </w:tblGrid>
+      <w:tr>
+        <w:tc>
+          <w:tcPr>
+            <w:tcW w:type="dxa" w:w="2880"/>
+          </w:tcPr>
+          <w:p>
+            <w:r>
+              <w:rPr>
+                <w:b/>
+                <w:sz w:val="18"/>
+              </w:rPr>
+              <w:t>ID</w:t>
+            </w:r>
+          </w:p>
+        </w:tc>
+        <w:tc>
+          <w:tcPr>
+            <w:tcW w:type="dxa" w:w="2880"/>
+          </w:tcPr>
+          <w:p>
+            <w:r>
+              <w:rPr>
+                <w:b/>
+                <w:sz w:val="18"/>
+              </w:rPr>
+              <w:t>Pin</w:t>
+            </w:r>
+          </w:p>
+        </w:tc>
+        <w:tc>
+          <w:tcPr>
+            <w:tcW w:type="dxa" w:w="2880"/>
+          </w:tcPr>
+          <w:p>
+            <w:r>
+              <w:rPr>
+                <w:b/>
+                <w:sz w:val="18"/>
+              </w:rPr>
+              <w:t>Fungsi</w:t>
+            </w:r>
+          </w:p>
+        </w:tc>
+      </w:tr>
+      <w:tr>
+        <w:tc>
+          <w:tcPr>
+            <w:tcW w:type="dxa" w:w="2880"/>
+          </w:tcPr>
+          <w:p>
+            <w:r>
+              <w:rPr>
+                <w:sz w:val="18"/>
+              </w:rPr>
+              <w:t>r</w:t>
+            </w:r>
+          </w:p>
+        </w:tc>
+        <w:tc>
+          <w:tcPr>
+            <w:tcW w:type="dxa" w:w="2880"/>
+          </w:tcPr>
+          <w:p>
+            <w:r>
+              <w:rPr>
+                <w:sz w:val="18"/>
+              </w:rPr>
+              <w:t>46</w:t>
+            </w:r>
+          </w:p>
+        </w:tc>
+        <w:tc>
+          <w:tcPr>
+            <w:tcW w:type="dxa" w:w="2880"/>
+          </w:tcPr>
+          <w:p>
+            <w:r>
+              <w:rPr>
+                <w:sz w:val="18"/>
+              </w:rPr>
+              <w:t>Right arm</w:t>
+            </w:r>
+          </w:p>
+        </w:tc>
+      </w:tr>
+      <w:tr>
+        <w:tc>
+          <w:tcPr>
+            <w:tcW w:type="dxa" w:w="2880"/>
+          </w:tcPr>
+          <w:p>
+            <w:r>
+              <w:rPr>
+                <w:sz w:val="18"/>
+              </w:rPr>
+              <w:t>l</w:t>
+            </w:r>
+          </w:p>
+        </w:tc>
+        <w:tc>
+          <w:tcPr>
+            <w:tcW w:type="dxa" w:w="2880"/>
+          </w:tcPr>
+          <w:p>
+            <w:r>
+              <w:rPr>
+                <w:sz w:val="18"/>
+              </w:rPr>
+              <w:t>9</w:t>
+            </w:r>
+          </w:p>
+        </w:tc>
+        <w:tc>
+          <w:tcPr>
+            <w:tcW w:type="dxa" w:w="2880"/>
+          </w:tcPr>
+          <w:p>
+            <w:r>
+              <w:rPr>
+                <w:sz w:val="18"/>
+              </w:rPr>
+              <w:t>Left arm</w:t>
+            </w:r>
+          </w:p>
+        </w:tc>
+      </w:tr>
+      <w:tr>
+        <w:tc>
+          <w:tcPr>
+            <w:tcW w:type="dxa" w:w="2880"/>
+          </w:tcPr>
+          <w:p>
+            <w:r>
+              <w:rPr>
+                <w:sz w:val="18"/>
+              </w:rPr>
+              <w:t>lk</w:t>
+            </w:r>
+          </w:p>
+        </w:tc>
+        <w:tc>
+          <w:tcPr>
+            <w:tcW w:type="dxa" w:w="2880"/>
+          </w:tcPr>
+          <w:p>
+            <w:r>
+              <w:rPr>
+                <w:sz w:val="18"/>
+              </w:rPr>
+              <w:t>10</w:t>
+            </w:r>
+          </w:p>
+        </w:tc>
+        <w:tc>
+          <w:tcPr>
+            <w:tcW w:type="dxa" w:w="2880"/>
+          </w:tcPr>
+          <w:p>
+            <w:r>
+              <w:rPr>
+                <w:sz w:val="18"/>
+              </w:rPr>
+              <w:t>Left kaki</w:t>
+            </w:r>
+          </w:p>
+        </w:tc>
+      </w:tr>
+      <w:tr>
+        <w:tc>
+          <w:tcPr>
+            <w:tcW w:type="dxa" w:w="2880"/>
+          </w:tcPr>
+          <w:p>
+            <w:r>
+              <w:rPr>
+                <w:sz w:val="18"/>
+              </w:rPr>
+              <w:t>rk</w:t>
+            </w:r>
+          </w:p>
+        </w:tc>
+        <w:tc>
+          <w:tcPr>
+            <w:tcW w:type="dxa" w:w="2880"/>
+          </w:tcPr>
+          <w:p>
+            <w:r>
+              <w:rPr>
+                <w:sz w:val="18"/>
+              </w:rPr>
+              <w:t>11</w:t>
+            </w:r>
+          </w:p>
+        </w:tc>
+        <w:tc>
+          <w:tcPr>
+            <w:tcW w:type="dxa" w:w="2880"/>
+          </w:tcPr>
+          <w:p>
+            <w:r>
+              <w:rPr>
+                <w:sz w:val="18"/>
+              </w:rPr>
+              <w:t>Right kaki</w:t>
+            </w:r>
+          </w:p>
+        </w:tc>
+      </w:tr>
+    </w:tbl>
+    <w:p>
+      <w:pPr>
+        <w:pStyle w:val="Heading1"/>
+      </w:pPr>
+      <w:r>
+        <w:t>12. Deep Sleep (Controller)</w:t>
+      </w:r>
+    </w:p>
+    <w:tbl>
+      <w:tblPr>
+        <w:tblStyle w:val="LightGrid-Accent1"/>
+        <w:tblW w:type="auto" w:w="0"/>
+        <w:jc w:val="left"/>
+        <w:tblLook w:firstColumn="1" w:firstRow="1" w:lastColumn="0" w:lastRow="0" w:noHBand="0" w:noVBand="1" w:val="04A0"/>
+      </w:tblPr>
+      <w:tblGrid>
+        <w:gridCol w:w="4320"/>
+        <w:gridCol w:w="4320"/>
+      </w:tblGrid>
+      <w:tr>
+        <w:tc>
+          <w:tcPr>
+            <w:tcW w:type="dxa" w:w="4320"/>
+          </w:tcPr>
+          <w:p>
+            <w:r>
+              <w:rPr>
+                <w:b/>
+                <w:sz w:val="18"/>
+              </w:rPr>
+              <w:t>Kondisi</w:t>
+            </w:r>
+          </w:p>
+        </w:tc>
+        <w:tc>
+          <w:tcPr>
+            <w:tcW w:type="dxa" w:w="4320"/>
+          </w:tcPr>
+          <w:p>
+            <w:r>
+              <w:rPr>
+                <w:b/>
+                <w:sz w:val="18"/>
+              </w:rPr>
+              <w:t>Aksi</w:t>
+            </w:r>
+          </w:p>
+        </w:tc>
+      </w:tr>
+      <w:tr>
+        <w:tc>
+          <w:tcPr>
+            <w:tcW w:type="dxa" w:w="4320"/>
+          </w:tcPr>
+          <w:p>
+            <w:r>
+              <w:rPr>
+                <w:sz w:val="18"/>
+              </w:rPr>
+              <w:t>Boot tanpa OTG &gt; 10 detik</w:t>
+            </w:r>
+          </w:p>
+        </w:tc>
+        <w:tc>
+          <w:tcPr>
+            <w:tcW w:type="dxa" w:w="4320"/>
+          </w:tcPr>
+          <w:p>
+            <w:r>
+              <w:rPr>
+                <w:sz w:val="18"/>
+              </w:rPr>
+              <w:t>Masuk deep sleep (timer wake 5 detik)</w:t>
+            </w:r>
+          </w:p>
+        </w:tc>
+      </w:tr>
+      <w:tr>
+        <w:tc>
+          <w:tcPr>
+            <w:tcW w:type="dxa" w:w="4320"/>
+          </w:tcPr>
+          <w:p>
+            <w:r>
+              <w:rPr>
+                <w:sz w:val="18"/>
+              </w:rPr>
+              <w:t>OTG cabut &gt; 10 detik</w:t>
+            </w:r>
+          </w:p>
+        </w:tc>
+        <w:tc>
+          <w:tcPr>
+            <w:tcW w:type="dxa" w:w="4320"/>
+          </w:tcPr>
+          <w:p>
+            <w:r>
+              <w:rPr>
+                <w:sz w:val="18"/>
+              </w:rPr>
+              <w:t>Kirim stop packet + masuk deep sleep</w:t>
+            </w:r>
+          </w:p>
+        </w:tc>
+      </w:tr>
+      <w:tr>
+        <w:tc>
+          <w:tcPr>
+            <w:tcW w:type="dxa" w:w="4320"/>
+          </w:tcPr>
+          <w:p>
+            <w:r>
+              <w:rPr>
+                <w:sz w:val="18"/>
+              </w:rPr>
+              <w:t>OTG masuk (dari sleep)</w:t>
+            </w:r>
+          </w:p>
+        </w:tc>
+        <w:tc>
+          <w:tcPr>
+            <w:tcW w:type="dxa" w:w="4320"/>
+          </w:tcPr>
+          <w:p>
+            <w:r>
+              <w:rPr>
+                <w:sz w:val="18"/>
+              </w:rPr>
+              <w:t>Full reboot → setup() → jalan normal</w:t>
             </w:r>
           </w:p>
         </w:tc>

</xml_diff>